<commit_message>
update:CHANGELOG and read me and protocol
</commit_message>
<xml_diff>
--- a/协议文档.docx
+++ b/协议文档.docx
@@ -11,7 +11,7 @@
           <w:szCs w:val="44"/>
         </w:rPr>
       </w:pPr>
-      <w:bookmarkStart w:id="0" w:name="_Toc225771107"/>
+      <w:bookmarkStart w:id="0" w:name="_Toc226636037"/>
       <w:r>
         <w:rPr>
           <w:rFonts w:hint="eastAsia"/>
@@ -94,7 +94,7 @@
           <w:r>
             <w:fldChar w:fldCharType="separate"/>
           </w:r>
-          <w:hyperlink w:anchor="_Toc225771107" w:history="1">
+          <w:hyperlink w:anchor="_Toc226636037" w:history="1">
             <w:r>
               <w:rPr>
                 <w:rStyle w:val="ae"/>
@@ -132,7 +132,7 @@
                 <w:noProof/>
                 <w:webHidden/>
               </w:rPr>
-              <w:instrText>PAGEREF _Toc225771107 \h</w:instrText>
+              <w:instrText>PAGEREF _Toc226636037 \h</w:instrText>
             </w:r>
             <w:r>
               <w:rPr>
@@ -188,7 +188,7 @@
               <w14:ligatures w14:val="standardContextual"/>
             </w:rPr>
           </w:pPr>
-          <w:hyperlink w:anchor="_Toc225771108" w:history="1">
+          <w:hyperlink w:anchor="_Toc226636038" w:history="1">
             <w:r>
               <w:rPr>
                 <w:rStyle w:val="ae"/>
@@ -226,7 +226,7 @@
                 <w:noProof/>
                 <w:webHidden/>
               </w:rPr>
-              <w:instrText>PAGEREF _Toc225771108 \h</w:instrText>
+              <w:instrText>PAGEREF _Toc226636038 \h</w:instrText>
             </w:r>
             <w:r>
               <w:rPr>
@@ -282,7 +282,7 @@
               <w14:ligatures w14:val="standardContextual"/>
             </w:rPr>
           </w:pPr>
-          <w:hyperlink w:anchor="_Toc225771109" w:history="1">
+          <w:hyperlink w:anchor="_Toc226636039" w:history="1">
             <w:r>
               <w:rPr>
                 <w:rStyle w:val="ae"/>
@@ -320,7 +320,7 @@
                 <w:noProof/>
                 <w:webHidden/>
               </w:rPr>
-              <w:instrText>PAGEREF _Toc225771109 \h</w:instrText>
+              <w:instrText>PAGEREF _Toc226636039 \h</w:instrText>
             </w:r>
             <w:r>
               <w:rPr>
@@ -376,7 +376,7 @@
               <w14:ligatures w14:val="standardContextual"/>
             </w:rPr>
           </w:pPr>
-          <w:hyperlink w:anchor="_Toc225771110" w:history="1">
+          <w:hyperlink w:anchor="_Toc226636040" w:history="1">
             <w:r>
               <w:rPr>
                 <w:rStyle w:val="ae"/>
@@ -414,7 +414,7 @@
                 <w:noProof/>
                 <w:webHidden/>
               </w:rPr>
-              <w:instrText>PAGEREF _Toc225771110 \h</w:instrText>
+              <w:instrText>PAGEREF _Toc226636040 \h</w:instrText>
             </w:r>
             <w:r>
               <w:rPr>
@@ -470,7 +470,7 @@
               <w14:ligatures w14:val="standardContextual"/>
             </w:rPr>
           </w:pPr>
-          <w:hyperlink w:anchor="_Toc225771111" w:history="1">
+          <w:hyperlink w:anchor="_Toc226636041" w:history="1">
             <w:r>
               <w:rPr>
                 <w:rStyle w:val="ae"/>
@@ -508,7 +508,7 @@
                 <w:noProof/>
                 <w:webHidden/>
               </w:rPr>
-              <w:instrText>PAGEREF _Toc225771111 \h</w:instrText>
+              <w:instrText>PAGEREF _Toc226636041 \h</w:instrText>
             </w:r>
             <w:r>
               <w:rPr>
@@ -564,7 +564,7 @@
               <w14:ligatures w14:val="standardContextual"/>
             </w:rPr>
           </w:pPr>
-          <w:hyperlink w:anchor="_Toc225771112" w:history="1">
+          <w:hyperlink w:anchor="_Toc226636042" w:history="1">
             <w:r>
               <w:rPr>
                 <w:rStyle w:val="ae"/>
@@ -602,7 +602,7 @@
                 <w:noProof/>
                 <w:webHidden/>
               </w:rPr>
-              <w:instrText>PAGEREF _Toc225771112 \h</w:instrText>
+              <w:instrText>PAGEREF _Toc226636042 \h</w:instrText>
             </w:r>
             <w:r>
               <w:rPr>
@@ -658,7 +658,7 @@
               <w14:ligatures w14:val="standardContextual"/>
             </w:rPr>
           </w:pPr>
-          <w:hyperlink w:anchor="_Toc225771113" w:history="1">
+          <w:hyperlink w:anchor="_Toc226636043" w:history="1">
             <w:r>
               <w:rPr>
                 <w:rStyle w:val="ae"/>
@@ -696,7 +696,7 @@
                 <w:noProof/>
                 <w:webHidden/>
               </w:rPr>
-              <w:instrText>PAGEREF _Toc225771113 \h</w:instrText>
+              <w:instrText>PAGEREF _Toc226636043 \h</w:instrText>
             </w:r>
             <w:r>
               <w:rPr>
@@ -752,7 +752,7 @@
               <w14:ligatures w14:val="standardContextual"/>
             </w:rPr>
           </w:pPr>
-          <w:hyperlink w:anchor="_Toc225771114" w:history="1">
+          <w:hyperlink w:anchor="_Toc226636044" w:history="1">
             <w:r>
               <w:rPr>
                 <w:rStyle w:val="ae"/>
@@ -806,7 +806,7 @@
                 <w:noProof/>
                 <w:webHidden/>
               </w:rPr>
-              <w:instrText>PAGEREF _Toc225771114 \h</w:instrText>
+              <w:instrText>PAGEREF _Toc226636044 \h</w:instrText>
             </w:r>
             <w:r>
               <w:rPr>
@@ -862,7 +862,7 @@
               <w14:ligatures w14:val="standardContextual"/>
             </w:rPr>
           </w:pPr>
-          <w:hyperlink w:anchor="_Toc225771115" w:history="1">
+          <w:hyperlink w:anchor="_Toc226636045" w:history="1">
             <w:r>
               <w:rPr>
                 <w:rStyle w:val="ae"/>
@@ -908,7 +908,7 @@
                 <w:noProof/>
                 <w:webHidden/>
               </w:rPr>
-              <w:instrText>PAGEREF _Toc225771115 \h</w:instrText>
+              <w:instrText>PAGEREF _Toc226636045 \h</w:instrText>
             </w:r>
             <w:r>
               <w:rPr>
@@ -964,7 +964,7 @@
               <w14:ligatures w14:val="standardContextual"/>
             </w:rPr>
           </w:pPr>
-          <w:hyperlink w:anchor="_Toc225771116" w:history="1">
+          <w:hyperlink w:anchor="_Toc226636046" w:history="1">
             <w:r>
               <w:rPr>
                 <w:rStyle w:val="ae"/>
@@ -1010,7 +1010,7 @@
                 <w:noProof/>
                 <w:webHidden/>
               </w:rPr>
-              <w:instrText>PAGEREF _Toc225771116 \h</w:instrText>
+              <w:instrText>PAGEREF _Toc226636046 \h</w:instrText>
             </w:r>
             <w:r>
               <w:rPr>
@@ -1066,7 +1066,7 @@
               <w14:ligatures w14:val="standardContextual"/>
             </w:rPr>
           </w:pPr>
-          <w:hyperlink w:anchor="_Toc225771117" w:history="1">
+          <w:hyperlink w:anchor="_Toc226636047" w:history="1">
             <w:r>
               <w:rPr>
                 <w:rStyle w:val="ae"/>
@@ -1112,7 +1112,7 @@
                 <w:noProof/>
                 <w:webHidden/>
               </w:rPr>
-              <w:instrText>PAGEREF _Toc225771117 \h</w:instrText>
+              <w:instrText>PAGEREF _Toc226636047 \h</w:instrText>
             </w:r>
             <w:r>
               <w:rPr>
@@ -1168,7 +1168,7 @@
               <w14:ligatures w14:val="standardContextual"/>
             </w:rPr>
           </w:pPr>
-          <w:hyperlink w:anchor="_Toc225771118" w:history="1">
+          <w:hyperlink w:anchor="_Toc226636048" w:history="1">
             <w:r>
               <w:rPr>
                 <w:rStyle w:val="ae"/>
@@ -1214,7 +1214,7 @@
                 <w:noProof/>
                 <w:webHidden/>
               </w:rPr>
-              <w:instrText>PAGEREF _Toc225771118 \h</w:instrText>
+              <w:instrText>PAGEREF _Toc226636048 \h</w:instrText>
             </w:r>
             <w:r>
               <w:rPr>
@@ -1270,7 +1270,7 @@
               <w14:ligatures w14:val="standardContextual"/>
             </w:rPr>
           </w:pPr>
-          <w:hyperlink w:anchor="_Toc225771119" w:history="1">
+          <w:hyperlink w:anchor="_Toc226636049" w:history="1">
             <w:r>
               <w:rPr>
                 <w:rStyle w:val="ae"/>
@@ -1316,7 +1316,7 @@
                 <w:noProof/>
                 <w:webHidden/>
               </w:rPr>
-              <w:instrText>PAGEREF _Toc225771119 \h</w:instrText>
+              <w:instrText>PAGEREF _Toc226636049 \h</w:instrText>
             </w:r>
             <w:r>
               <w:rPr>
@@ -1372,7 +1372,7 @@
               <w14:ligatures w14:val="standardContextual"/>
             </w:rPr>
           </w:pPr>
-          <w:hyperlink w:anchor="_Toc225771120" w:history="1">
+          <w:hyperlink w:anchor="_Toc226636050" w:history="1">
             <w:r>
               <w:rPr>
                 <w:rStyle w:val="ae"/>
@@ -1418,7 +1418,7 @@
                 <w:noProof/>
                 <w:webHidden/>
               </w:rPr>
-              <w:instrText>PAGEREF _Toc225771120 \h</w:instrText>
+              <w:instrText>PAGEREF _Toc226636050 \h</w:instrText>
             </w:r>
             <w:r>
               <w:rPr>
@@ -1474,7 +1474,7 @@
               <w14:ligatures w14:val="standardContextual"/>
             </w:rPr>
           </w:pPr>
-          <w:hyperlink w:anchor="_Toc225771121" w:history="1">
+          <w:hyperlink w:anchor="_Toc226636051" w:history="1">
             <w:r>
               <w:rPr>
                 <w:rStyle w:val="ae"/>
@@ -1520,7 +1520,7 @@
                 <w:noProof/>
                 <w:webHidden/>
               </w:rPr>
-              <w:instrText>PAGEREF _Toc225771121 \h</w:instrText>
+              <w:instrText>PAGEREF _Toc226636051 \h</w:instrText>
             </w:r>
             <w:r>
               <w:rPr>
@@ -1576,7 +1576,7 @@
               <w14:ligatures w14:val="standardContextual"/>
             </w:rPr>
           </w:pPr>
-          <w:hyperlink w:anchor="_Toc225771122" w:history="1">
+          <w:hyperlink w:anchor="_Toc226636052" w:history="1">
             <w:r>
               <w:rPr>
                 <w:rStyle w:val="ae"/>
@@ -1622,7 +1622,7 @@
                 <w:noProof/>
                 <w:webHidden/>
               </w:rPr>
-              <w:instrText>PAGEREF _Toc225771122 \h</w:instrText>
+              <w:instrText>PAGEREF _Toc226636052 \h</w:instrText>
             </w:r>
             <w:r>
               <w:rPr>
@@ -1652,7 +1652,7 @@
                 <w:noProof/>
                 <w:webHidden/>
               </w:rPr>
-              <w:t>7</w:t>
+              <w:t>8</w:t>
             </w:r>
             <w:r>
               <w:rPr>
@@ -1678,7 +1678,7 @@
               <w14:ligatures w14:val="standardContextual"/>
             </w:rPr>
           </w:pPr>
-          <w:hyperlink w:anchor="_Toc225771123" w:history="1">
+          <w:hyperlink w:anchor="_Toc226636053" w:history="1">
             <w:r>
               <w:rPr>
                 <w:rStyle w:val="ae"/>
@@ -1724,7 +1724,7 @@
                 <w:noProof/>
                 <w:webHidden/>
               </w:rPr>
-              <w:instrText>PAGEREF _Toc225771123 \h</w:instrText>
+              <w:instrText>PAGEREF _Toc226636053 \h</w:instrText>
             </w:r>
             <w:r>
               <w:rPr>
@@ -1780,7 +1780,7 @@
               <w14:ligatures w14:val="standardContextual"/>
             </w:rPr>
           </w:pPr>
-          <w:hyperlink w:anchor="_Toc225771124" w:history="1">
+          <w:hyperlink w:anchor="_Toc226636054" w:history="1">
             <w:r>
               <w:rPr>
                 <w:rStyle w:val="ae"/>
@@ -1826,7 +1826,7 @@
                 <w:noProof/>
                 <w:webHidden/>
               </w:rPr>
-              <w:instrText>PAGEREF _Toc225771124 \h</w:instrText>
+              <w:instrText>PAGEREF _Toc226636054 \h</w:instrText>
             </w:r>
             <w:r>
               <w:rPr>
@@ -1882,7 +1882,7 @@
               <w14:ligatures w14:val="standardContextual"/>
             </w:rPr>
           </w:pPr>
-          <w:hyperlink w:anchor="_Toc225771125" w:history="1">
+          <w:hyperlink w:anchor="_Toc226636055" w:history="1">
             <w:r>
               <w:rPr>
                 <w:rStyle w:val="ae"/>
@@ -1928,7 +1928,7 @@
                 <w:noProof/>
                 <w:webHidden/>
               </w:rPr>
-              <w:instrText>PAGEREF _Toc225771125 \h</w:instrText>
+              <w:instrText>PAGEREF _Toc226636055 \h</w:instrText>
             </w:r>
             <w:r>
               <w:rPr>
@@ -1984,7 +1984,7 @@
               <w14:ligatures w14:val="standardContextual"/>
             </w:rPr>
           </w:pPr>
-          <w:hyperlink w:anchor="_Toc225771126" w:history="1">
+          <w:hyperlink w:anchor="_Toc226636056" w:history="1">
             <w:r>
               <w:rPr>
                 <w:rStyle w:val="ae"/>
@@ -2030,7 +2030,7 @@
                 <w:noProof/>
                 <w:webHidden/>
               </w:rPr>
-              <w:instrText>PAGEREF _Toc225771126 \h</w:instrText>
+              <w:instrText>PAGEREF _Toc226636056 \h</w:instrText>
             </w:r>
             <w:r>
               <w:rPr>
@@ -2086,7 +2086,7 @@
               <w14:ligatures w14:val="standardContextual"/>
             </w:rPr>
           </w:pPr>
-          <w:hyperlink w:anchor="_Toc225771127" w:history="1">
+          <w:hyperlink w:anchor="_Toc226636057" w:history="1">
             <w:r>
               <w:rPr>
                 <w:rStyle w:val="ae"/>
@@ -2132,7 +2132,7 @@
                 <w:noProof/>
                 <w:webHidden/>
               </w:rPr>
-              <w:instrText>PAGEREF _Toc225771127 \h</w:instrText>
+              <w:instrText>PAGEREF _Toc226636057 \h</w:instrText>
             </w:r>
             <w:r>
               <w:rPr>
@@ -2188,7 +2188,7 @@
               <w14:ligatures w14:val="standardContextual"/>
             </w:rPr>
           </w:pPr>
-          <w:hyperlink w:anchor="_Toc225771128" w:history="1">
+          <w:hyperlink w:anchor="_Toc226636058" w:history="1">
             <w:r>
               <w:rPr>
                 <w:rStyle w:val="ae"/>
@@ -2234,7 +2234,7 @@
                 <w:noProof/>
                 <w:webHidden/>
               </w:rPr>
-              <w:instrText>PAGEREF _Toc225771128 \h</w:instrText>
+              <w:instrText>PAGEREF _Toc226636058 \h</w:instrText>
             </w:r>
             <w:r>
               <w:rPr>
@@ -2290,7 +2290,7 @@
               <w14:ligatures w14:val="standardContextual"/>
             </w:rPr>
           </w:pPr>
-          <w:hyperlink w:anchor="_Toc225771129" w:history="1">
+          <w:hyperlink w:anchor="_Toc226636059" w:history="1">
             <w:r>
               <w:rPr>
                 <w:rStyle w:val="ae"/>
@@ -2336,7 +2336,7 @@
                 <w:noProof/>
                 <w:webHidden/>
               </w:rPr>
-              <w:instrText>PAGEREF _Toc225771129 \h</w:instrText>
+              <w:instrText>PAGEREF _Toc226636059 \h</w:instrText>
             </w:r>
             <w:r>
               <w:rPr>
@@ -2392,7 +2392,7 @@
               <w14:ligatures w14:val="standardContextual"/>
             </w:rPr>
           </w:pPr>
-          <w:hyperlink w:anchor="_Toc225771130" w:history="1">
+          <w:hyperlink w:anchor="_Toc226636060" w:history="1">
             <w:r>
               <w:rPr>
                 <w:rStyle w:val="ae"/>
@@ -2438,7 +2438,7 @@
                 <w:noProof/>
                 <w:webHidden/>
               </w:rPr>
-              <w:instrText>PAGEREF _Toc225771130 \h</w:instrText>
+              <w:instrText>PAGEREF _Toc226636060 \h</w:instrText>
             </w:r>
             <w:r>
               <w:rPr>
@@ -2494,7 +2494,7 @@
               <w14:ligatures w14:val="standardContextual"/>
             </w:rPr>
           </w:pPr>
-          <w:hyperlink w:anchor="_Toc225771131" w:history="1">
+          <w:hyperlink w:anchor="_Toc226636061" w:history="1">
             <w:r>
               <w:rPr>
                 <w:rStyle w:val="ae"/>
@@ -2540,7 +2540,7 @@
                 <w:noProof/>
                 <w:webHidden/>
               </w:rPr>
-              <w:instrText>PAGEREF _Toc225771131 \h</w:instrText>
+              <w:instrText>PAGEREF _Toc226636061 \h</w:instrText>
             </w:r>
             <w:r>
               <w:rPr>
@@ -2596,7 +2596,7 @@
               <w14:ligatures w14:val="standardContextual"/>
             </w:rPr>
           </w:pPr>
-          <w:hyperlink w:anchor="_Toc225771132" w:history="1">
+          <w:hyperlink w:anchor="_Toc226636062" w:history="1">
             <w:r>
               <w:rPr>
                 <w:rStyle w:val="ae"/>
@@ -2642,7 +2642,7 @@
                 <w:noProof/>
                 <w:webHidden/>
               </w:rPr>
-              <w:instrText>PAGEREF _Toc225771132 \h</w:instrText>
+              <w:instrText>PAGEREF _Toc226636062 \h</w:instrText>
             </w:r>
             <w:r>
               <w:rPr>
@@ -2698,7 +2698,7 @@
               <w14:ligatures w14:val="standardContextual"/>
             </w:rPr>
           </w:pPr>
-          <w:hyperlink w:anchor="_Toc225771133" w:history="1">
+          <w:hyperlink w:anchor="_Toc226636063" w:history="1">
             <w:r>
               <w:rPr>
                 <w:rStyle w:val="ae"/>
@@ -2744,7 +2744,7 @@
                 <w:noProof/>
                 <w:webHidden/>
               </w:rPr>
-              <w:instrText>PAGEREF _Toc225771133 \h</w:instrText>
+              <w:instrText>PAGEREF _Toc226636063 \h</w:instrText>
             </w:r>
             <w:r>
               <w:rPr>
@@ -2800,7 +2800,7 @@
               <w14:ligatures w14:val="standardContextual"/>
             </w:rPr>
           </w:pPr>
-          <w:hyperlink w:anchor="_Toc225771134" w:history="1">
+          <w:hyperlink w:anchor="_Toc226636064" w:history="1">
             <w:r>
               <w:rPr>
                 <w:rStyle w:val="ae"/>
@@ -2846,7 +2846,7 @@
                 <w:noProof/>
                 <w:webHidden/>
               </w:rPr>
-              <w:instrText>PAGEREF _Toc225771134 \h</w:instrText>
+              <w:instrText>PAGEREF _Toc226636064 \h</w:instrText>
             </w:r>
             <w:r>
               <w:rPr>
@@ -2902,7 +2902,7 @@
               <w14:ligatures w14:val="standardContextual"/>
             </w:rPr>
           </w:pPr>
-          <w:hyperlink w:anchor="_Toc225771135" w:history="1">
+          <w:hyperlink w:anchor="_Toc226636065" w:history="1">
             <w:r>
               <w:rPr>
                 <w:rStyle w:val="ae"/>
@@ -2948,7 +2948,7 @@
                 <w:noProof/>
                 <w:webHidden/>
               </w:rPr>
-              <w:instrText>PAGEREF _Toc225771135 \h</w:instrText>
+              <w:instrText>PAGEREF _Toc226636065 \h</w:instrText>
             </w:r>
             <w:r>
               <w:rPr>
@@ -3004,7 +3004,7 @@
               <w14:ligatures w14:val="standardContextual"/>
             </w:rPr>
           </w:pPr>
-          <w:hyperlink w:anchor="_Toc225771136" w:history="1">
+          <w:hyperlink w:anchor="_Toc226636066" w:history="1">
             <w:r>
               <w:rPr>
                 <w:rStyle w:val="ae"/>
@@ -3050,7 +3050,7 @@
                 <w:noProof/>
                 <w:webHidden/>
               </w:rPr>
-              <w:instrText>PAGEREF _Toc225771136 \h</w:instrText>
+              <w:instrText>PAGEREF _Toc226636066 \h</w:instrText>
             </w:r>
             <w:r>
               <w:rPr>
@@ -3106,7 +3106,7 @@
               <w14:ligatures w14:val="standardContextual"/>
             </w:rPr>
           </w:pPr>
-          <w:hyperlink w:anchor="_Toc225771137" w:history="1">
+          <w:hyperlink w:anchor="_Toc226636067" w:history="1">
             <w:r>
               <w:rPr>
                 <w:rStyle w:val="ae"/>
@@ -3152,7 +3152,7 @@
                 <w:noProof/>
                 <w:webHidden/>
               </w:rPr>
-              <w:instrText>PAGEREF _Toc225771137 \h</w:instrText>
+              <w:instrText>PAGEREF _Toc226636067 \h</w:instrText>
             </w:r>
             <w:r>
               <w:rPr>
@@ -3208,7 +3208,7 @@
               <w14:ligatures w14:val="standardContextual"/>
             </w:rPr>
           </w:pPr>
-          <w:hyperlink w:anchor="_Toc225771138" w:history="1">
+          <w:hyperlink w:anchor="_Toc226636068" w:history="1">
             <w:r>
               <w:rPr>
                 <w:rStyle w:val="ae"/>
@@ -3254,7 +3254,7 @@
                 <w:noProof/>
                 <w:webHidden/>
               </w:rPr>
-              <w:instrText>PAGEREF _Toc225771138 \h</w:instrText>
+              <w:instrText>PAGEREF _Toc226636068 \h</w:instrText>
             </w:r>
             <w:r>
               <w:rPr>
@@ -3310,7 +3310,7 @@
               <w14:ligatures w14:val="standardContextual"/>
             </w:rPr>
           </w:pPr>
-          <w:hyperlink w:anchor="_Toc225771139" w:history="1">
+          <w:hyperlink w:anchor="_Toc226636069" w:history="1">
             <w:r>
               <w:rPr>
                 <w:rStyle w:val="ae"/>
@@ -3356,7 +3356,7 @@
                 <w:noProof/>
                 <w:webHidden/>
               </w:rPr>
-              <w:instrText>PAGEREF _Toc225771139 \h</w:instrText>
+              <w:instrText>PAGEREF _Toc226636069 \h</w:instrText>
             </w:r>
             <w:r>
               <w:rPr>
@@ -3412,7 +3412,7 @@
               <w14:ligatures w14:val="standardContextual"/>
             </w:rPr>
           </w:pPr>
-          <w:hyperlink w:anchor="_Toc225771140" w:history="1">
+          <w:hyperlink w:anchor="_Toc226636070" w:history="1">
             <w:r>
               <w:rPr>
                 <w:rStyle w:val="ae"/>
@@ -3458,7 +3458,7 @@
                 <w:noProof/>
                 <w:webHidden/>
               </w:rPr>
-              <w:instrText>PAGEREF _Toc225771140 \h</w:instrText>
+              <w:instrText>PAGEREF _Toc226636070 \h</w:instrText>
             </w:r>
             <w:r>
               <w:rPr>
@@ -3514,7 +3514,7 @@
               <w14:ligatures w14:val="standardContextual"/>
             </w:rPr>
           </w:pPr>
-          <w:hyperlink w:anchor="_Toc225771141" w:history="1">
+          <w:hyperlink w:anchor="_Toc226636071" w:history="1">
             <w:r>
               <w:rPr>
                 <w:rStyle w:val="ae"/>
@@ -3560,7 +3560,7 @@
                 <w:noProof/>
                 <w:webHidden/>
               </w:rPr>
-              <w:instrText>PAGEREF _Toc225771141 \h</w:instrText>
+              <w:instrText>PAGEREF _Toc226636071 \h</w:instrText>
             </w:r>
             <w:r>
               <w:rPr>
@@ -3616,7 +3616,7 @@
               <w14:ligatures w14:val="standardContextual"/>
             </w:rPr>
           </w:pPr>
-          <w:hyperlink w:anchor="_Toc225771142" w:history="1">
+          <w:hyperlink w:anchor="_Toc226636072" w:history="1">
             <w:r>
               <w:rPr>
                 <w:rStyle w:val="ae"/>
@@ -3662,7 +3662,7 @@
                 <w:noProof/>
                 <w:webHidden/>
               </w:rPr>
-              <w:instrText>PAGEREF _Toc225771142 \h</w:instrText>
+              <w:instrText>PAGEREF _Toc226636072 \h</w:instrText>
             </w:r>
             <w:r>
               <w:rPr>
@@ -3718,7 +3718,7 @@
               <w14:ligatures w14:val="standardContextual"/>
             </w:rPr>
           </w:pPr>
-          <w:hyperlink w:anchor="_Toc225771143" w:history="1">
+          <w:hyperlink w:anchor="_Toc226636073" w:history="1">
             <w:r>
               <w:rPr>
                 <w:rStyle w:val="ae"/>
@@ -3764,7 +3764,7 @@
                 <w:noProof/>
                 <w:webHidden/>
               </w:rPr>
-              <w:instrText>PAGEREF _Toc225771143 \h</w:instrText>
+              <w:instrText>PAGEREF _Toc226636073 \h</w:instrText>
             </w:r>
             <w:r>
               <w:rPr>
@@ -3820,7 +3820,7 @@
               <w14:ligatures w14:val="standardContextual"/>
             </w:rPr>
           </w:pPr>
-          <w:hyperlink w:anchor="_Toc225771144" w:history="1">
+          <w:hyperlink w:anchor="_Toc226636074" w:history="1">
             <w:r>
               <w:rPr>
                 <w:rStyle w:val="ae"/>
@@ -3866,7 +3866,7 @@
                 <w:noProof/>
                 <w:webHidden/>
               </w:rPr>
-              <w:instrText>PAGEREF _Toc225771144 \h</w:instrText>
+              <w:instrText>PAGEREF _Toc226636074 \h</w:instrText>
             </w:r>
             <w:r>
               <w:rPr>
@@ -3922,7 +3922,7 @@
               <w14:ligatures w14:val="standardContextual"/>
             </w:rPr>
           </w:pPr>
-          <w:hyperlink w:anchor="_Toc225771145" w:history="1">
+          <w:hyperlink w:anchor="_Toc226636075" w:history="1">
             <w:r>
               <w:rPr>
                 <w:rStyle w:val="ae"/>
@@ -3968,7 +3968,7 @@
                 <w:noProof/>
                 <w:webHidden/>
               </w:rPr>
-              <w:instrText>PAGEREF _Toc225771145 \h</w:instrText>
+              <w:instrText>PAGEREF _Toc226636075 \h</w:instrText>
             </w:r>
             <w:r>
               <w:rPr>
@@ -4024,7 +4024,7 @@
               <w14:ligatures w14:val="standardContextual"/>
             </w:rPr>
           </w:pPr>
-          <w:hyperlink w:anchor="_Toc225771146" w:history="1">
+          <w:hyperlink w:anchor="_Toc226636076" w:history="1">
             <w:r>
               <w:rPr>
                 <w:rStyle w:val="ae"/>
@@ -4070,7 +4070,7 @@
                 <w:noProof/>
                 <w:webHidden/>
               </w:rPr>
-              <w:instrText>PAGEREF _Toc225771146 \h</w:instrText>
+              <w:instrText>PAGEREF _Toc226636076 \h</w:instrText>
             </w:r>
             <w:r>
               <w:rPr>
@@ -4126,7 +4126,7 @@
               <w14:ligatures w14:val="standardContextual"/>
             </w:rPr>
           </w:pPr>
-          <w:hyperlink w:anchor="_Toc225771147" w:history="1">
+          <w:hyperlink w:anchor="_Toc226636077" w:history="1">
             <w:r>
               <w:rPr>
                 <w:rStyle w:val="ae"/>
@@ -4172,7 +4172,7 @@
                 <w:noProof/>
                 <w:webHidden/>
               </w:rPr>
-              <w:instrText>PAGEREF _Toc225771147 \h</w:instrText>
+              <w:instrText>PAGEREF _Toc226636077 \h</w:instrText>
             </w:r>
             <w:r>
               <w:rPr>
@@ -4228,7 +4228,7 @@
               <w14:ligatures w14:val="standardContextual"/>
             </w:rPr>
           </w:pPr>
-          <w:hyperlink w:anchor="_Toc225771148" w:history="1">
+          <w:hyperlink w:anchor="_Toc226636078" w:history="1">
             <w:r>
               <w:rPr>
                 <w:rStyle w:val="ae"/>
@@ -4282,7 +4282,7 @@
                 <w:noProof/>
                 <w:webHidden/>
               </w:rPr>
-              <w:instrText>PAGEREF _Toc225771148 \h</w:instrText>
+              <w:instrText>PAGEREF _Toc226636078 \h</w:instrText>
             </w:r>
             <w:r>
               <w:rPr>
@@ -4338,7 +4338,7 @@
               <w14:ligatures w14:val="standardContextual"/>
             </w:rPr>
           </w:pPr>
-          <w:hyperlink w:anchor="_Toc225771149" w:history="1">
+          <w:hyperlink w:anchor="_Toc226636079" w:history="1">
             <w:r>
               <w:rPr>
                 <w:rStyle w:val="ae"/>
@@ -4384,7 +4384,7 @@
                 <w:noProof/>
                 <w:webHidden/>
               </w:rPr>
-              <w:instrText>PAGEREF _Toc225771149 \h</w:instrText>
+              <w:instrText>PAGEREF _Toc226636079 \h</w:instrText>
             </w:r>
             <w:r>
               <w:rPr>
@@ -4440,7 +4440,7 @@
               <w14:ligatures w14:val="standardContextual"/>
             </w:rPr>
           </w:pPr>
-          <w:hyperlink w:anchor="_Toc225771150" w:history="1">
+          <w:hyperlink w:anchor="_Toc226636080" w:history="1">
             <w:r>
               <w:rPr>
                 <w:rStyle w:val="ae"/>
@@ -4486,7 +4486,7 @@
                 <w:noProof/>
                 <w:webHidden/>
               </w:rPr>
-              <w:instrText>PAGEREF _Toc225771150 \h</w:instrText>
+              <w:instrText>PAGEREF _Toc226636080 \h</w:instrText>
             </w:r>
             <w:r>
               <w:rPr>
@@ -4542,7 +4542,7 @@
               <w14:ligatures w14:val="standardContextual"/>
             </w:rPr>
           </w:pPr>
-          <w:hyperlink w:anchor="_Toc225771151" w:history="1">
+          <w:hyperlink w:anchor="_Toc226636081" w:history="1">
             <w:r>
               <w:rPr>
                 <w:rStyle w:val="ae"/>
@@ -4596,7 +4596,7 @@
                 <w:noProof/>
                 <w:webHidden/>
               </w:rPr>
-              <w:instrText>PAGEREF _Toc225771151 \h</w:instrText>
+              <w:instrText>PAGEREF _Toc226636081 \h</w:instrText>
             </w:r>
             <w:r>
               <w:rPr>
@@ -4652,7 +4652,7 @@
               <w14:ligatures w14:val="standardContextual"/>
             </w:rPr>
           </w:pPr>
-          <w:hyperlink w:anchor="_Toc225771152" w:history="1">
+          <w:hyperlink w:anchor="_Toc226636082" w:history="1">
             <w:r>
               <w:rPr>
                 <w:rStyle w:val="ae"/>
@@ -4690,7 +4690,7 @@
                 <w:noProof/>
                 <w:webHidden/>
               </w:rPr>
-              <w:instrText>PAGEREF _Toc225771152 \h</w:instrText>
+              <w:instrText>PAGEREF _Toc226636082 \h</w:instrText>
             </w:r>
             <w:r>
               <w:rPr>
@@ -4746,7 +4746,7 @@
               <w14:ligatures w14:val="standardContextual"/>
             </w:rPr>
           </w:pPr>
-          <w:hyperlink w:anchor="_Toc225771153" w:history="1">
+          <w:hyperlink w:anchor="_Toc226636083" w:history="1">
             <w:r>
               <w:rPr>
                 <w:rStyle w:val="ae"/>
@@ -4784,7 +4784,7 @@
                 <w:noProof/>
                 <w:webHidden/>
               </w:rPr>
-              <w:instrText>PAGEREF _Toc225771153 \h</w:instrText>
+              <w:instrText>PAGEREF _Toc226636083 \h</w:instrText>
             </w:r>
             <w:r>
               <w:rPr>
@@ -4840,7 +4840,7 @@
               <w14:ligatures w14:val="standardContextual"/>
             </w:rPr>
           </w:pPr>
-          <w:hyperlink w:anchor="_Toc225771154" w:history="1">
+          <w:hyperlink w:anchor="_Toc226636084" w:history="1">
             <w:r>
               <w:rPr>
                 <w:rStyle w:val="ae"/>
@@ -4878,7 +4878,7 @@
                 <w:noProof/>
                 <w:webHidden/>
               </w:rPr>
-              <w:instrText>PAGEREF _Toc225771154 \h</w:instrText>
+              <w:instrText>PAGEREF _Toc226636084 \h</w:instrText>
             </w:r>
             <w:r>
               <w:rPr>
@@ -4934,7 +4934,7 @@
               <w14:ligatures w14:val="standardContextual"/>
             </w:rPr>
           </w:pPr>
-          <w:hyperlink w:anchor="_Toc225771155" w:history="1">
+          <w:hyperlink w:anchor="_Toc226636085" w:history="1">
             <w:r>
               <w:rPr>
                 <w:rStyle w:val="ae"/>
@@ -4972,7 +4972,7 @@
                 <w:noProof/>
                 <w:webHidden/>
               </w:rPr>
-              <w:instrText>PAGEREF _Toc225771155 \h</w:instrText>
+              <w:instrText>PAGEREF _Toc226636085 \h</w:instrText>
             </w:r>
             <w:r>
               <w:rPr>
@@ -5028,7 +5028,7 @@
               <w14:ligatures w14:val="standardContextual"/>
             </w:rPr>
           </w:pPr>
-          <w:hyperlink w:anchor="_Toc225771156" w:history="1">
+          <w:hyperlink w:anchor="_Toc226636086" w:history="1">
             <w:r>
               <w:rPr>
                 <w:rStyle w:val="ae"/>
@@ -5082,7 +5082,7 @@
                 <w:noProof/>
                 <w:webHidden/>
               </w:rPr>
-              <w:instrText>PAGEREF _Toc225771156 \h</w:instrText>
+              <w:instrText>PAGEREF _Toc226636086 \h</w:instrText>
             </w:r>
             <w:r>
               <w:rPr>
@@ -5138,7 +5138,7 @@
               <w14:ligatures w14:val="standardContextual"/>
             </w:rPr>
           </w:pPr>
-          <w:hyperlink w:anchor="_Toc225771157" w:history="1">
+          <w:hyperlink w:anchor="_Toc226636087" w:history="1">
             <w:r>
               <w:rPr>
                 <w:rStyle w:val="ae"/>
@@ -5192,7 +5192,7 @@
                 <w:noProof/>
                 <w:webHidden/>
               </w:rPr>
-              <w:instrText>PAGEREF _Toc225771157 \h</w:instrText>
+              <w:instrText>PAGEREF _Toc226636087 \h</w:instrText>
             </w:r>
             <w:r>
               <w:rPr>
@@ -5248,7 +5248,7 @@
               <w14:ligatures w14:val="standardContextual"/>
             </w:rPr>
           </w:pPr>
-          <w:hyperlink w:anchor="_Toc225771158" w:history="1">
+          <w:hyperlink w:anchor="_Toc226636088" w:history="1">
             <w:r>
               <w:rPr>
                 <w:rStyle w:val="ae"/>
@@ -5286,7 +5286,7 @@
                 <w:noProof/>
                 <w:webHidden/>
               </w:rPr>
-              <w:instrText>PAGEREF _Toc225771158 \h</w:instrText>
+              <w:instrText>PAGEREF _Toc226636088 \h</w:instrText>
             </w:r>
             <w:r>
               <w:rPr>
@@ -5342,7 +5342,7 @@
               <w14:ligatures w14:val="standardContextual"/>
             </w:rPr>
           </w:pPr>
-          <w:hyperlink w:anchor="_Toc225771159" w:history="1">
+          <w:hyperlink w:anchor="_Toc226636089" w:history="1">
             <w:r>
               <w:rPr>
                 <w:rStyle w:val="ae"/>
@@ -5396,7 +5396,7 @@
                 <w:noProof/>
                 <w:webHidden/>
               </w:rPr>
-              <w:instrText>PAGEREF _Toc225771159 \h</w:instrText>
+              <w:instrText>PAGEREF _Toc226636089 \h</w:instrText>
             </w:r>
             <w:r>
               <w:rPr>
@@ -5969,7 +5969,7 @@
               <w:rPr>
                 <w:rFonts w:hint="eastAsia"/>
               </w:rPr>
-              <w:t>1</w:t>
+              <w:t>6</w:t>
             </w:r>
             <w:r>
               <w:rPr>
@@ -6080,7 +6080,7 @@
               <w:rPr>
                 <w:rFonts w:hint="eastAsia"/>
               </w:rPr>
-              <w:t>3</w:t>
+              <w:t>4</w:t>
             </w:r>
             <w:r>
               <w:t>-</w:t>
@@ -6089,7 +6089,7 @@
               <w:rPr>
                 <w:rFonts w:hint="eastAsia"/>
               </w:rPr>
-              <w:t>30</w:t>
+              <w:t>09</w:t>
             </w:r>
           </w:p>
         </w:tc>
@@ -6186,7 +6186,7 @@
       <w:pPr>
         <w:pStyle w:val="1"/>
       </w:pPr>
-      <w:bookmarkStart w:id="1" w:name="_Toc225771108"/>
+      <w:bookmarkStart w:id="1" w:name="_Toc226636038"/>
       <w:r>
         <w:rPr>
           <w:rFonts w:hint="eastAsia"/>
@@ -6200,7 +6200,7 @@
       <w:pPr>
         <w:pStyle w:val="2"/>
       </w:pPr>
-      <w:bookmarkStart w:id="2" w:name="_Toc225771109"/>
+      <w:bookmarkStart w:id="2" w:name="_Toc226636039"/>
       <w:r>
         <w:rPr>
           <w:rFonts w:hint="eastAsia"/>
@@ -6248,7 +6248,7 @@
       <w:pPr>
         <w:pStyle w:val="2"/>
       </w:pPr>
-      <w:bookmarkStart w:id="3" w:name="_Toc225771110"/>
+      <w:bookmarkStart w:id="3" w:name="_Toc226636040"/>
       <w:r>
         <w:rPr>
           <w:rFonts w:hint="eastAsia"/>
@@ -6281,7 +6281,7 @@
       <w:pPr>
         <w:pStyle w:val="2"/>
       </w:pPr>
-      <w:bookmarkStart w:id="4" w:name="_Toc225771111"/>
+      <w:bookmarkStart w:id="4" w:name="_Toc226636041"/>
       <w:r>
         <w:rPr>
           <w:rFonts w:hint="eastAsia"/>
@@ -8525,7 +8525,7 @@
         <w:adjustRightInd w:val="0"/>
         <w:jc w:val="left"/>
         <w:rPr>
-          <w:rFonts w:ascii="新宋体" w:eastAsia="新宋体" w:hAnsi="Times New Roman" w:cs="新宋体" w:hint="eastAsia"/>
+          <w:rFonts w:ascii="新宋体" w:eastAsia="新宋体" w:hAnsi="Times New Roman" w:cs="新宋体"/>
           <w:color w:val="000000"/>
           <w:kern w:val="0"/>
           <w:sz w:val="19"/>
@@ -8614,7 +8614,7 @@
     <w:p>
       <w:pPr>
         <w:rPr>
-          <w:rFonts w:ascii="新宋体" w:eastAsia="新宋体" w:hAnsi="Times New Roman" w:cs="新宋体" w:hint="eastAsia"/>
+          <w:rFonts w:ascii="新宋体" w:eastAsia="新宋体" w:hAnsi="Times New Roman" w:cs="新宋体"/>
           <w:color w:val="008000"/>
           <w:kern w:val="0"/>
           <w:sz w:val="19"/>
@@ -8754,11 +8754,6 @@
       </w:r>
     </w:p>
     <w:p>
-      <w:pPr>
-        <w:rPr>
-          <w:rFonts w:hint="eastAsia"/>
-        </w:rPr>
-      </w:pPr>
       <w:r>
         <w:rPr>
           <w:rFonts w:hint="eastAsia"/>
@@ -8891,11 +8886,6 @@
       </w:r>
     </w:p>
     <w:p>
-      <w:pPr>
-        <w:rPr>
-          <w:rFonts w:hint="eastAsia"/>
-        </w:rPr>
-      </w:pPr>
       <w:r>
         <w:rPr>
           <w:rFonts w:hint="eastAsia"/>
@@ -9057,11 +9047,6 @@
       </w:r>
     </w:p>
     <w:p>
-      <w:pPr>
-        <w:rPr>
-          <w:rFonts w:hint="eastAsia"/>
-        </w:rPr>
-      </w:pPr>
       <w:r>
         <w:rPr>
           <w:rFonts w:hint="eastAsia"/>
@@ -9122,7 +9107,7 @@
       <w:pPr>
         <w:pStyle w:val="2"/>
       </w:pPr>
-      <w:bookmarkStart w:id="5" w:name="_Toc225771112"/>
+      <w:bookmarkStart w:id="5" w:name="_Toc226636042"/>
       <w:r>
         <w:rPr>
           <w:rFonts w:hint="eastAsia"/>
@@ -9449,7 +9434,7 @@
       <w:pPr>
         <w:pStyle w:val="1"/>
       </w:pPr>
-      <w:bookmarkStart w:id="6" w:name="_Toc225771113"/>
+      <w:bookmarkStart w:id="6" w:name="_Toc226636043"/>
       <w:r>
         <w:rPr>
           <w:rFonts w:hint="eastAsia"/>
@@ -9657,7 +9642,7 @@
       <w:pPr>
         <w:pStyle w:val="1"/>
       </w:pPr>
-      <w:bookmarkStart w:id="7" w:name="_Toc225771114"/>
+      <w:bookmarkStart w:id="7" w:name="_Toc226636044"/>
       <w:proofErr w:type="gramStart"/>
       <w:r>
         <w:rPr>
@@ -9684,7 +9669,7 @@
       <w:pPr>
         <w:pStyle w:val="2"/>
       </w:pPr>
-      <w:bookmarkStart w:id="8" w:name="_Toc225771115"/>
+      <w:bookmarkStart w:id="8" w:name="_Toc226636045"/>
       <w:r>
         <w:rPr>
           <w:rFonts w:hint="eastAsia"/>
@@ -9703,7 +9688,7 @@
       <w:pPr>
         <w:pStyle w:val="3"/>
       </w:pPr>
-      <w:bookmarkStart w:id="9" w:name="_Toc225771116"/>
+      <w:bookmarkStart w:id="9" w:name="_Toc226636046"/>
       <w:r>
         <w:rPr>
           <w:rFonts w:hint="eastAsia"/>
@@ -9883,6 +9868,11 @@
       <w:proofErr w:type="spellEnd"/>
     </w:p>
     <w:p>
+      <w:pPr>
+        <w:rPr>
+          <w:rFonts w:hint="eastAsia"/>
+        </w:rPr>
+      </w:pPr>
       <w:r>
         <w:rPr>
           <w:rFonts w:hint="eastAsia"/>
@@ -9969,6 +9959,44 @@
         </w:rPr>
         <w:t>秒</w:t>
       </w:r>
+      <w:r>
+        <w:rPr>
+          <w:rFonts w:hint="eastAsia"/>
+        </w:rPr>
+        <w:t>,</w:t>
+      </w:r>
+      <w:r>
+        <w:t xml:space="preserve"> </w:t>
+      </w:r>
+      <w:proofErr w:type="spellStart"/>
+      <w:r>
+        <w:t>bindaddr</w:t>
+      </w:r>
+      <w:proofErr w:type="spellEnd"/>
+      <w:r>
+        <w:rPr>
+          <w:rFonts w:hint="eastAsia"/>
+        </w:rPr>
+        <w:t xml:space="preserve"> </w:t>
+      </w:r>
+      <w:r>
+        <w:rPr>
+          <w:rFonts w:hint="eastAsia"/>
+        </w:rPr>
+        <w:t>仅限</w:t>
+      </w:r>
+      <w:r>
+        <w:rPr>
+          <w:rFonts w:hint="eastAsia"/>
+        </w:rPr>
+        <w:t>UDP,</w:t>
+      </w:r>
+      <w:r>
+        <w:rPr>
+          <w:rFonts w:hint="eastAsia"/>
+        </w:rPr>
+        <w:t>可以指定输出在某个指定网卡上</w:t>
+      </w:r>
     </w:p>
     <w:p>
       <w:r>
@@ -9976,6 +10004,11 @@
       </w:r>
     </w:p>
     <w:p>
+      <w:pPr>
+        <w:rPr>
+          <w:rFonts w:hint="eastAsia"/>
+        </w:rPr>
+      </w:pPr>
       <w:r>
         <w:rPr>
           <w:rFonts w:hint="eastAsia"/>
@@ -10010,6 +10043,11 @@
       </w:r>
     </w:p>
     <w:p>
+      <w:pPr>
+        <w:rPr>
+          <w:rFonts w:hint="eastAsia"/>
+        </w:rPr>
+      </w:pPr>
       <w:r>
         <w:rPr>
           <w:rFonts w:hint="eastAsia"/>
@@ -10049,6 +10087,19 @@
       </w:r>
       <w:proofErr w:type="spellStart"/>
       <w:r>
+        <w:t>bindaddr</w:t>
+      </w:r>
+      <w:proofErr w:type="spellEnd"/>
+      <w:r>
+        <w:t>": "10.0.0.52",</w:t>
+      </w:r>
+    </w:p>
+    <w:p>
+      <w:r>
+        <w:t xml:space="preserve">    "</w:t>
+      </w:r>
+      <w:proofErr w:type="spellStart"/>
+      <w:r>
         <w:t>nVersion</w:t>
       </w:r>
       <w:proofErr w:type="spellEnd"/>
@@ -10083,6 +10134,11 @@
       </w:r>
     </w:p>
     <w:p>
+      <w:pPr>
+        <w:rPr>
+          <w:rFonts w:hint="eastAsia"/>
+        </w:rPr>
+      </w:pPr>
       <w:r>
         <w:t>}</w:t>
       </w:r>
@@ -10271,187 +10327,477 @@
         <w:rPr>
           <w:rFonts w:hint="eastAsia"/>
         </w:rPr>
+        <w:lastRenderedPageBreak/>
         <w:t>转录文件</w:t>
       </w:r>
     </w:p>
     <w:p>
       <w:r>
+        <w:t>{</w:t>
+      </w:r>
+    </w:p>
+    <w:p>
+      <w:r>
+        <w:t xml:space="preserve">    "</w:t>
+      </w:r>
+      <w:proofErr w:type="spellStart"/>
+      <w:r>
+        <w:t>streamaddr</w:t>
+      </w:r>
+      <w:proofErr w:type="spellEnd"/>
+      <w:r>
+        <w:t xml:space="preserve">": </w:t>
+      </w:r>
+      <w:proofErr w:type="gramStart"/>
+      <w:r>
+        <w:t>"./</w:t>
+      </w:r>
+      <w:proofErr w:type="spellStart"/>
+      <w:proofErr w:type="gramEnd"/>
+      <w:r>
+        <w:t>hls</w:t>
+      </w:r>
+      <w:proofErr w:type="spellEnd"/>
+      <w:r>
+        <w:t>/1.m3u8",</w:t>
+      </w:r>
+    </w:p>
+    <w:p>
+      <w:r>
+        <w:t xml:space="preserve">    "</w:t>
+      </w:r>
+      <w:proofErr w:type="spellStart"/>
+      <w:r>
+        <w:t>streamtype</w:t>
+      </w:r>
+      <w:proofErr w:type="spellEnd"/>
+      <w:r>
+        <w:t>": "</w:t>
+      </w:r>
+      <w:proofErr w:type="spellStart"/>
+      <w:r>
+        <w:t>mpegts</w:t>
+      </w:r>
+      <w:proofErr w:type="spellEnd"/>
+      <w:r>
+        <w:t>",</w:t>
+      </w:r>
+    </w:p>
+    <w:p>
+      <w:r>
+        <w:t xml:space="preserve">    "</w:t>
+      </w:r>
+      <w:proofErr w:type="spellStart"/>
+      <w:r>
+        <w:t>streamtime</w:t>
+      </w:r>
+      <w:proofErr w:type="spellEnd"/>
+      <w:r>
+        <w:t>": 10</w:t>
+      </w:r>
+    </w:p>
+    <w:p>
+      <w:r>
+        <w:t>}</w:t>
+      </w:r>
+    </w:p>
+    <w:p>
+      <w:pPr>
+        <w:pStyle w:val="3"/>
+      </w:pPr>
+      <w:bookmarkStart w:id="10" w:name="_Toc226636047"/>
+      <w:r>
+        <w:rPr>
+          <w:rFonts w:hint="eastAsia"/>
+        </w:rPr>
+        <w:t xml:space="preserve">1.1.2 </w:t>
+      </w:r>
+      <w:r>
+        <w:rPr>
+          <w:rFonts w:hint="eastAsia"/>
+        </w:rPr>
+        <w:t>回复</w:t>
+      </w:r>
+      <w:bookmarkEnd w:id="10"/>
+    </w:p>
+    <w:p>
+      <w:r>
+        <w:rPr>
+          <w:rFonts w:hint="eastAsia"/>
+        </w:rPr>
+        <w:t xml:space="preserve">    </w:t>
+      </w:r>
+      <w:r>
+        <w:rPr>
+          <w:rFonts w:hint="eastAsia"/>
+        </w:rPr>
+        <w:t>返回的</w:t>
+      </w:r>
+      <w:r>
+        <w:rPr>
+          <w:rFonts w:hint="eastAsia"/>
+        </w:rPr>
+        <w:t>token</w:t>
+      </w:r>
+      <w:r>
+        <w:rPr>
+          <w:rFonts w:hint="eastAsia"/>
+        </w:rPr>
+        <w:t>是数值类型</w:t>
+      </w:r>
+    </w:p>
+    <w:p>
+      <w:r>
+        <w:t>{</w:t>
+      </w:r>
+    </w:p>
+    <w:p>
+      <w:r>
+        <w:t xml:space="preserve">    "code":0,</w:t>
+      </w:r>
+    </w:p>
+    <w:p>
+      <w:r>
+        <w:t xml:space="preserve">    "</w:t>
+      </w:r>
+      <w:proofErr w:type="spellStart"/>
+      <w:r>
+        <w:t>msg":"success</w:t>
+      </w:r>
+      <w:proofErr w:type="spellEnd"/>
+      <w:r>
+        <w:t>",</w:t>
+      </w:r>
+    </w:p>
+    <w:p>
+      <w:r>
+        <w:t xml:space="preserve">    "token":100010001</w:t>
+      </w:r>
+    </w:p>
+    <w:p>
+      <w:r>
+        <w:t>}</w:t>
+      </w:r>
+    </w:p>
+    <w:p>
+      <w:pPr>
+        <w:pStyle w:val="2"/>
+      </w:pPr>
+      <w:bookmarkStart w:id="11" w:name="_Toc226636048"/>
+      <w:r>
+        <w:rPr>
+          <w:rFonts w:hint="eastAsia"/>
+        </w:rPr>
+        <w:t xml:space="preserve">1.2 </w:t>
+      </w:r>
+      <w:r>
+        <w:rPr>
+          <w:rFonts w:hint="eastAsia"/>
+        </w:rPr>
+        <w:t>停止</w:t>
+      </w:r>
+      <w:bookmarkEnd w:id="11"/>
+    </w:p>
+    <w:p>
+      <w:pPr>
+        <w:pStyle w:val="3"/>
+      </w:pPr>
+      <w:bookmarkStart w:id="12" w:name="_Toc226636049"/>
+      <w:r>
+        <w:rPr>
+          <w:rFonts w:hint="eastAsia"/>
+        </w:rPr>
+        <w:t xml:space="preserve">1.2.1 </w:t>
+      </w:r>
+      <w:r>
+        <w:rPr>
+          <w:rFonts w:hint="eastAsia"/>
+        </w:rPr>
+        <w:t>请求</w:t>
+      </w:r>
+      <w:bookmarkEnd w:id="12"/>
+    </w:p>
+    <w:p>
+      <w:r>
+        <w:rPr>
+          <w:rFonts w:hint="eastAsia"/>
+        </w:rPr>
+        <w:t>接口</w:t>
+      </w:r>
+      <w:r>
+        <w:rPr>
+          <w:rFonts w:hint="eastAsia"/>
+        </w:rPr>
+        <w:t>:HTTP</w:t>
+      </w:r>
+    </w:p>
+    <w:p>
+      <w:r>
+        <w:rPr>
+          <w:rFonts w:hint="eastAsia"/>
+        </w:rPr>
+        <w:t>方法</w:t>
+      </w:r>
+      <w:r>
+        <w:rPr>
+          <w:rFonts w:hint="eastAsia"/>
+        </w:rPr>
+        <w:t>:</w:t>
+      </w:r>
+      <w:r>
+        <w:rPr>
+          <w:rFonts w:hint="eastAsia"/>
+        </w:rPr>
+        <w:t>GET</w:t>
+      </w:r>
+    </w:p>
+    <w:p>
+      <w:r>
+        <w:rPr>
+          <w:rFonts w:hint="eastAsia"/>
+        </w:rPr>
+        <w:t>地址</w:t>
+      </w:r>
+      <w:r>
+        <w:rPr>
+          <w:rFonts w:hint="eastAsia"/>
+        </w:rPr>
+        <w:t>:http://127.0.0.1:</w:t>
+      </w:r>
+      <w:r>
+        <w:rPr>
+          <w:rFonts w:hint="eastAsia"/>
+        </w:rPr>
+        <w:t>5001</w:t>
+      </w:r>
+      <w:r>
+        <w:rPr>
+          <w:rFonts w:hint="eastAsia"/>
+        </w:rPr>
+        <w:t>/</w:t>
+      </w:r>
+      <w:proofErr w:type="spellStart"/>
+      <w:r>
+        <w:rPr>
+          <w:rFonts w:hint="eastAsia"/>
+        </w:rPr>
+        <w:t>api?function</w:t>
+      </w:r>
+      <w:proofErr w:type="spellEnd"/>
+      <w:r>
+        <w:rPr>
+          <w:rFonts w:hint="eastAsia"/>
+        </w:rPr>
+        <w:t>=</w:t>
+      </w:r>
+      <w:proofErr w:type="spellStart"/>
+      <w:r>
+        <w:rPr>
+          <w:rFonts w:hint="eastAsia"/>
+        </w:rPr>
+        <w:t>stop&amp;token</w:t>
+      </w:r>
+      <w:proofErr w:type="spellEnd"/>
+      <w:r>
+        <w:rPr>
+          <w:rFonts w:hint="eastAsia"/>
+        </w:rPr>
+        <w:t>=10001001</w:t>
+      </w:r>
+    </w:p>
+    <w:p>
+      <w:r>
+        <w:rPr>
+          <w:rFonts w:hint="eastAsia"/>
+        </w:rPr>
+        <w:t>注意</w:t>
+      </w:r>
+      <w:r>
+        <w:rPr>
+          <w:rFonts w:hint="eastAsia"/>
+        </w:rPr>
+        <w:t>:</w:t>
+      </w:r>
+      <w:r>
+        <w:rPr>
+          <w:rFonts w:hint="eastAsia"/>
+        </w:rPr>
+        <w:t>可以不带</w:t>
+      </w:r>
+      <w:r>
+        <w:rPr>
+          <w:rFonts w:hint="eastAsia"/>
+        </w:rPr>
+        <w:t>token,</w:t>
+      </w:r>
+      <w:r>
+        <w:rPr>
+          <w:rFonts w:hint="eastAsia"/>
+        </w:rPr>
+        <w:t>使用</w:t>
+      </w:r>
+      <w:r>
+        <w:fldChar w:fldCharType="begin"/>
+      </w:r>
+      <w:r>
+        <w:instrText>HYPERLINK "http://127.0.0.1:5001/api?function=stop&amp;exist=0"</w:instrText>
+      </w:r>
+      <w:r>
+        <w:fldChar w:fldCharType="separate"/>
+      </w:r>
+      <w:r>
+        <w:rPr>
+          <w:rStyle w:val="ae"/>
+          <w:rFonts w:hint="eastAsia"/>
+        </w:rPr>
+        <w:t>http://127.0.0.1:5001/api?function=stop&amp;</w:t>
+      </w:r>
+      <w:r>
+        <w:rPr>
+          <w:rStyle w:val="ae"/>
+        </w:rPr>
+        <w:t>exist</w:t>
+      </w:r>
+      <w:r>
+        <w:rPr>
+          <w:rStyle w:val="ae"/>
+          <w:rFonts w:hint="eastAsia"/>
+        </w:rPr>
+        <w:t>=0</w:t>
+      </w:r>
+      <w:r>
+        <w:fldChar w:fldCharType="end"/>
+      </w:r>
+      <w:r>
+        <w:rPr>
+          <w:rFonts w:hint="eastAsia"/>
+        </w:rPr>
+        <w:t xml:space="preserve"> </w:t>
+      </w:r>
+      <w:r>
+        <w:rPr>
+          <w:rFonts w:hint="eastAsia"/>
+        </w:rPr>
+        <w:t>主程序会正常退出</w:t>
+      </w:r>
+    </w:p>
+    <w:p>
+      <w:pPr>
+        <w:pStyle w:val="3"/>
+      </w:pPr>
+      <w:bookmarkStart w:id="13" w:name="_Toc226636050"/>
+      <w:r>
+        <w:rPr>
+          <w:rFonts w:hint="eastAsia"/>
+        </w:rPr>
+        <w:t xml:space="preserve">1.2.2 </w:t>
+      </w:r>
+      <w:r>
+        <w:rPr>
+          <w:rFonts w:hint="eastAsia"/>
+        </w:rPr>
+        <w:t>回复</w:t>
+      </w:r>
+      <w:bookmarkEnd w:id="13"/>
+    </w:p>
+    <w:p>
+      <w:r>
+        <w:t>{</w:t>
+      </w:r>
+    </w:p>
+    <w:p>
+      <w:r>
+        <w:t xml:space="preserve">    "code":0,</w:t>
+      </w:r>
+    </w:p>
+    <w:p>
+      <w:r>
+        <w:t xml:space="preserve">    "</w:t>
+      </w:r>
+      <w:proofErr w:type="spellStart"/>
+      <w:r>
+        <w:t>msg":"success</w:t>
+      </w:r>
+      <w:proofErr w:type="spellEnd"/>
+      <w:r>
+        <w:t>"</w:t>
+      </w:r>
+      <w:r>
+        <w:t>,</w:t>
+      </w:r>
+    </w:p>
+    <w:p>
+      <w:r>
+        <w:t xml:space="preserve">    "token":100010001</w:t>
+      </w:r>
+    </w:p>
+    <w:p>
+      <w:r>
+        <w:t>}</w:t>
+      </w:r>
+    </w:p>
+    <w:p>
+      <w:pPr>
+        <w:pStyle w:val="2"/>
+      </w:pPr>
+      <w:bookmarkStart w:id="14" w:name="_Toc226636051"/>
+      <w:r>
+        <w:rPr>
+          <w:rFonts w:hint="eastAsia"/>
+        </w:rPr>
+        <w:t xml:space="preserve">1.3 </w:t>
+      </w:r>
+      <w:r>
+        <w:rPr>
+          <w:rFonts w:hint="eastAsia"/>
+        </w:rPr>
+        <w:t>播放</w:t>
+      </w:r>
+      <w:bookmarkEnd w:id="14"/>
+    </w:p>
+    <w:p>
+      <w:r>
+        <w:rPr>
+          <w:rFonts w:hint="eastAsia"/>
+        </w:rPr>
+        <w:t xml:space="preserve">    </w:t>
+      </w:r>
+      <w:r>
+        <w:rPr>
+          <w:rFonts w:hint="eastAsia"/>
+        </w:rPr>
+        <w:t>如果是定时播放</w:t>
+      </w:r>
+      <w:r>
+        <w:rPr>
+          <w:rFonts w:hint="eastAsia"/>
+        </w:rPr>
+        <w:t>需要提前</w:t>
+      </w:r>
+      <w:r>
+        <w:rPr>
+          <w:rFonts w:hint="eastAsia"/>
+        </w:rPr>
+        <w:t>2</w:t>
+      </w:r>
+      <w:r>
+        <w:rPr>
+          <w:rFonts w:hint="eastAsia"/>
+        </w:rPr>
+        <w:t>秒告知</w:t>
+      </w:r>
+    </w:p>
+    <w:p>
+      <w:pPr>
+        <w:pStyle w:val="3"/>
+      </w:pPr>
+      <w:bookmarkStart w:id="15" w:name="_Toc226636052"/>
+      <w:r>
+        <w:rPr>
+          <w:rFonts w:hint="eastAsia"/>
+        </w:rPr>
         <w:lastRenderedPageBreak/>
-        <w:t>{</w:t>
-      </w:r>
-    </w:p>
-    <w:p>
-      <w:r>
-        <w:t xml:space="preserve">    "</w:t>
-      </w:r>
-      <w:proofErr w:type="spellStart"/>
-      <w:r>
-        <w:t>streamaddr</w:t>
-      </w:r>
-      <w:proofErr w:type="spellEnd"/>
-      <w:r>
-        <w:t xml:space="preserve">": </w:t>
-      </w:r>
-      <w:proofErr w:type="gramStart"/>
-      <w:r>
-        <w:t>"./</w:t>
-      </w:r>
-      <w:proofErr w:type="spellStart"/>
-      <w:proofErr w:type="gramEnd"/>
-      <w:r>
-        <w:t>hls</w:t>
-      </w:r>
-      <w:proofErr w:type="spellEnd"/>
-      <w:r>
-        <w:t>/1.m3u8",</w:t>
-      </w:r>
-    </w:p>
-    <w:p>
-      <w:r>
-        <w:t xml:space="preserve">    "</w:t>
-      </w:r>
-      <w:proofErr w:type="spellStart"/>
-      <w:r>
-        <w:t>streamtype</w:t>
-      </w:r>
-      <w:proofErr w:type="spellEnd"/>
-      <w:r>
-        <w:t>": "</w:t>
-      </w:r>
-      <w:proofErr w:type="spellStart"/>
-      <w:r>
-        <w:t>mpegts</w:t>
-      </w:r>
-      <w:proofErr w:type="spellEnd"/>
-      <w:r>
-        <w:t>",</w:t>
-      </w:r>
-    </w:p>
-    <w:p>
-      <w:r>
-        <w:t xml:space="preserve">    "</w:t>
-      </w:r>
-      <w:proofErr w:type="spellStart"/>
-      <w:r>
-        <w:t>streamtime</w:t>
-      </w:r>
-      <w:proofErr w:type="spellEnd"/>
-      <w:r>
-        <w:t>": 10</w:t>
-      </w:r>
-    </w:p>
-    <w:p>
-      <w:r>
-        <w:t>}</w:t>
-      </w:r>
-    </w:p>
-    <w:p>
-      <w:pPr>
-        <w:pStyle w:val="3"/>
-      </w:pPr>
-      <w:bookmarkStart w:id="10" w:name="_Toc225771117"/>
-      <w:r>
-        <w:rPr>
-          <w:rFonts w:hint="eastAsia"/>
-        </w:rPr>
-        <w:t xml:space="preserve">1.1.2 </w:t>
-      </w:r>
-      <w:r>
-        <w:rPr>
-          <w:rFonts w:hint="eastAsia"/>
-        </w:rPr>
-        <w:t>回复</w:t>
-      </w:r>
-      <w:bookmarkEnd w:id="10"/>
-    </w:p>
-    <w:p>
-      <w:r>
-        <w:rPr>
-          <w:rFonts w:hint="eastAsia"/>
-        </w:rPr>
-        <w:t xml:space="preserve">    </w:t>
-      </w:r>
-      <w:r>
-        <w:rPr>
-          <w:rFonts w:hint="eastAsia"/>
-        </w:rPr>
-        <w:t>返回的</w:t>
-      </w:r>
-      <w:r>
-        <w:rPr>
-          <w:rFonts w:hint="eastAsia"/>
-        </w:rPr>
-        <w:t>token</w:t>
-      </w:r>
-      <w:r>
-        <w:rPr>
-          <w:rFonts w:hint="eastAsia"/>
-        </w:rPr>
-        <w:t>是数值类型</w:t>
-      </w:r>
-    </w:p>
-    <w:p>
-      <w:r>
-        <w:t>{</w:t>
-      </w:r>
-    </w:p>
-    <w:p>
-      <w:r>
-        <w:t xml:space="preserve">    "code":0,</w:t>
-      </w:r>
-    </w:p>
-    <w:p>
-      <w:r>
-        <w:t xml:space="preserve">    "</w:t>
-      </w:r>
-      <w:proofErr w:type="spellStart"/>
-      <w:r>
-        <w:t>msg":"success</w:t>
-      </w:r>
-      <w:proofErr w:type="spellEnd"/>
-      <w:r>
-        <w:t>",</w:t>
-      </w:r>
-    </w:p>
-    <w:p>
-      <w:r>
-        <w:t xml:space="preserve">    "token":100010001</w:t>
-      </w:r>
-    </w:p>
-    <w:p>
-      <w:r>
-        <w:t>}</w:t>
-      </w:r>
-    </w:p>
-    <w:p>
-      <w:pPr>
-        <w:pStyle w:val="2"/>
-      </w:pPr>
-      <w:bookmarkStart w:id="11" w:name="_Toc225771118"/>
-      <w:r>
-        <w:rPr>
-          <w:rFonts w:hint="eastAsia"/>
-        </w:rPr>
-        <w:t xml:space="preserve">1.2 </w:t>
-      </w:r>
-      <w:r>
-        <w:rPr>
-          <w:rFonts w:hint="eastAsia"/>
-        </w:rPr>
-        <w:t>停止</w:t>
-      </w:r>
-      <w:bookmarkEnd w:id="11"/>
-    </w:p>
-    <w:p>
-      <w:pPr>
-        <w:pStyle w:val="3"/>
-      </w:pPr>
-      <w:bookmarkStart w:id="12" w:name="_Toc225771119"/>
-      <w:r>
-        <w:rPr>
-          <w:rFonts w:hint="eastAsia"/>
-        </w:rPr>
-        <w:t xml:space="preserve">1.2.1 </w:t>
+        <w:t xml:space="preserve">1.3.1 </w:t>
       </w:r>
       <w:r>
         <w:rPr>
@@ -10459,7 +10805,7 @@
         </w:rPr>
         <w:t>请求</w:t>
       </w:r>
-      <w:bookmarkEnd w:id="12"/>
+      <w:bookmarkEnd w:id="15"/>
     </w:p>
     <w:p>
       <w:r>
@@ -10480,296 +10826,6 @@
         <w:rPr>
           <w:rFonts w:hint="eastAsia"/>
         </w:rPr>
-        <w:t>方法</w:t>
-      </w:r>
-      <w:r>
-        <w:rPr>
-          <w:rFonts w:hint="eastAsia"/>
-        </w:rPr>
-        <w:t>:</w:t>
-      </w:r>
-      <w:r>
-        <w:rPr>
-          <w:rFonts w:hint="eastAsia"/>
-        </w:rPr>
-        <w:t>GET</w:t>
-      </w:r>
-    </w:p>
-    <w:p>
-      <w:r>
-        <w:rPr>
-          <w:rFonts w:hint="eastAsia"/>
-        </w:rPr>
-        <w:t>地址</w:t>
-      </w:r>
-      <w:r>
-        <w:rPr>
-          <w:rFonts w:hint="eastAsia"/>
-        </w:rPr>
-        <w:t>:http://127.0.0.1:</w:t>
-      </w:r>
-      <w:r>
-        <w:rPr>
-          <w:rFonts w:hint="eastAsia"/>
-        </w:rPr>
-        <w:t>5001</w:t>
-      </w:r>
-      <w:r>
-        <w:rPr>
-          <w:rFonts w:hint="eastAsia"/>
-        </w:rPr>
-        <w:t>/</w:t>
-      </w:r>
-      <w:proofErr w:type="spellStart"/>
-      <w:r>
-        <w:rPr>
-          <w:rFonts w:hint="eastAsia"/>
-        </w:rPr>
-        <w:t>api?function</w:t>
-      </w:r>
-      <w:proofErr w:type="spellEnd"/>
-      <w:r>
-        <w:rPr>
-          <w:rFonts w:hint="eastAsia"/>
-        </w:rPr>
-        <w:t>=</w:t>
-      </w:r>
-      <w:proofErr w:type="spellStart"/>
-      <w:r>
-        <w:rPr>
-          <w:rFonts w:hint="eastAsia"/>
-        </w:rPr>
-        <w:t>stop&amp;token</w:t>
-      </w:r>
-      <w:proofErr w:type="spellEnd"/>
-      <w:r>
-        <w:rPr>
-          <w:rFonts w:hint="eastAsia"/>
-        </w:rPr>
-        <w:t>=10001001</w:t>
-      </w:r>
-    </w:p>
-    <w:p>
-      <w:r>
-        <w:rPr>
-          <w:rFonts w:hint="eastAsia"/>
-        </w:rPr>
-        <w:t>注意</w:t>
-      </w:r>
-      <w:r>
-        <w:rPr>
-          <w:rFonts w:hint="eastAsia"/>
-        </w:rPr>
-        <w:t>:</w:t>
-      </w:r>
-      <w:r>
-        <w:rPr>
-          <w:rFonts w:hint="eastAsia"/>
-        </w:rPr>
-        <w:t>可以不带</w:t>
-      </w:r>
-      <w:r>
-        <w:rPr>
-          <w:rFonts w:hint="eastAsia"/>
-        </w:rPr>
-        <w:t>token,</w:t>
-      </w:r>
-      <w:r>
-        <w:rPr>
-          <w:rFonts w:hint="eastAsia"/>
-        </w:rPr>
-        <w:t>使用</w:t>
-      </w:r>
-      <w:r>
-        <w:fldChar w:fldCharType="begin"/>
-      </w:r>
-      <w:r>
-        <w:instrText>HYPERLINK "http://127.0.0.1:5001/api?function=stop&amp;exist=0"</w:instrText>
-      </w:r>
-      <w:r>
-        <w:fldChar w:fldCharType="separate"/>
-      </w:r>
-      <w:r>
-        <w:rPr>
-          <w:rStyle w:val="ae"/>
-          <w:rFonts w:hint="eastAsia"/>
-        </w:rPr>
-        <w:t>http://127.0.0.1:5001/api?function=stop&amp;</w:t>
-      </w:r>
-      <w:r>
-        <w:rPr>
-          <w:rStyle w:val="ae"/>
-        </w:rPr>
-        <w:t>exist</w:t>
-      </w:r>
-      <w:r>
-        <w:rPr>
-          <w:rStyle w:val="ae"/>
-          <w:rFonts w:hint="eastAsia"/>
-        </w:rPr>
-        <w:t>=0</w:t>
-      </w:r>
-      <w:r>
-        <w:fldChar w:fldCharType="end"/>
-      </w:r>
-      <w:r>
-        <w:rPr>
-          <w:rFonts w:hint="eastAsia"/>
-        </w:rPr>
-        <w:t xml:space="preserve"> </w:t>
-      </w:r>
-      <w:r>
-        <w:rPr>
-          <w:rFonts w:hint="eastAsia"/>
-        </w:rPr>
-        <w:t>主程序会正常退出</w:t>
-      </w:r>
-    </w:p>
-    <w:p>
-      <w:pPr>
-        <w:pStyle w:val="3"/>
-      </w:pPr>
-      <w:bookmarkStart w:id="13" w:name="_Toc225771120"/>
-      <w:r>
-        <w:rPr>
-          <w:rFonts w:hint="eastAsia"/>
-        </w:rPr>
-        <w:t xml:space="preserve">1.2.2 </w:t>
-      </w:r>
-      <w:r>
-        <w:rPr>
-          <w:rFonts w:hint="eastAsia"/>
-        </w:rPr>
-        <w:t>回复</w:t>
-      </w:r>
-      <w:bookmarkEnd w:id="13"/>
-    </w:p>
-    <w:p>
-      <w:r>
-        <w:t>{</w:t>
-      </w:r>
-    </w:p>
-    <w:p>
-      <w:r>
-        <w:t xml:space="preserve">    "code":0,</w:t>
-      </w:r>
-    </w:p>
-    <w:p>
-      <w:r>
-        <w:t xml:space="preserve">    "</w:t>
-      </w:r>
-      <w:proofErr w:type="spellStart"/>
-      <w:r>
-        <w:t>msg":"success</w:t>
-      </w:r>
-      <w:proofErr w:type="spellEnd"/>
-      <w:r>
-        <w:t>"</w:t>
-      </w:r>
-      <w:r>
-        <w:t>,</w:t>
-      </w:r>
-    </w:p>
-    <w:p>
-      <w:r>
-        <w:t xml:space="preserve">    "token":100010001</w:t>
-      </w:r>
-    </w:p>
-    <w:p>
-      <w:r>
-        <w:t>}</w:t>
-      </w:r>
-    </w:p>
-    <w:p>
-      <w:pPr>
-        <w:pStyle w:val="2"/>
-      </w:pPr>
-      <w:bookmarkStart w:id="14" w:name="_Toc225771121"/>
-      <w:r>
-        <w:rPr>
-          <w:rFonts w:hint="eastAsia"/>
-        </w:rPr>
-        <w:t xml:space="preserve">1.3 </w:t>
-      </w:r>
-      <w:r>
-        <w:rPr>
-          <w:rFonts w:hint="eastAsia"/>
-        </w:rPr>
-        <w:t>播放</w:t>
-      </w:r>
-      <w:bookmarkEnd w:id="14"/>
-    </w:p>
-    <w:p>
-      <w:r>
-        <w:rPr>
-          <w:rFonts w:hint="eastAsia"/>
-        </w:rPr>
-        <w:t xml:space="preserve">    </w:t>
-      </w:r>
-      <w:r>
-        <w:rPr>
-          <w:rFonts w:hint="eastAsia"/>
-        </w:rPr>
-        <w:t>如果是定时播放</w:t>
-      </w:r>
-      <w:r>
-        <w:rPr>
-          <w:rFonts w:hint="eastAsia"/>
-        </w:rPr>
-        <w:t>需要提前</w:t>
-      </w:r>
-      <w:r>
-        <w:rPr>
-          <w:rFonts w:hint="eastAsia"/>
-        </w:rPr>
-        <w:t>2</w:t>
-      </w:r>
-      <w:r>
-        <w:rPr>
-          <w:rFonts w:hint="eastAsia"/>
-        </w:rPr>
-        <w:t>秒告知</w:t>
-      </w:r>
-    </w:p>
-    <w:p>
-      <w:pPr>
-        <w:pStyle w:val="3"/>
-      </w:pPr>
-      <w:bookmarkStart w:id="15" w:name="_Toc225771122"/>
-      <w:r>
-        <w:rPr>
-          <w:rFonts w:hint="eastAsia"/>
-        </w:rPr>
-        <w:t xml:space="preserve">1.3.1 </w:t>
-      </w:r>
-      <w:r>
-        <w:rPr>
-          <w:rFonts w:hint="eastAsia"/>
-        </w:rPr>
-        <w:t>请求</w:t>
-      </w:r>
-      <w:bookmarkEnd w:id="15"/>
-    </w:p>
-    <w:p>
-      <w:r>
-        <w:rPr>
-          <w:rFonts w:hint="eastAsia"/>
-        </w:rPr>
-        <w:t>接口</w:t>
-      </w:r>
-      <w:r>
-        <w:rPr>
-          <w:rFonts w:hint="eastAsia"/>
-        </w:rPr>
-        <w:t>:HTTP</w:t>
-      </w:r>
-    </w:p>
-    <w:p>
-      <w:r>
-        <w:rPr>
-          <w:rFonts w:hint="eastAsia"/>
-        </w:rPr>
-        <w:lastRenderedPageBreak/>
         <w:t>方法</w:t>
       </w:r>
       <w:r>
@@ -11864,7 +11920,7 @@
       <w:pPr>
         <w:pStyle w:val="3"/>
       </w:pPr>
-      <w:bookmarkStart w:id="16" w:name="_Toc225771123"/>
+      <w:bookmarkStart w:id="16" w:name="_Toc226636053"/>
       <w:r>
         <w:rPr>
           <w:rFonts w:hint="eastAsia"/>
@@ -11911,7 +11967,7 @@
       <w:pPr>
         <w:pStyle w:val="2"/>
       </w:pPr>
-      <w:bookmarkStart w:id="17" w:name="_Toc225771124"/>
+      <w:bookmarkStart w:id="17" w:name="_Toc226636054"/>
       <w:r>
         <w:rPr>
           <w:rFonts w:hint="eastAsia"/>
@@ -11931,7 +11987,7 @@
       <w:pPr>
         <w:pStyle w:val="3"/>
       </w:pPr>
-      <w:bookmarkStart w:id="18" w:name="_Toc225771125"/>
+      <w:bookmarkStart w:id="18" w:name="_Toc226636055"/>
       <w:r>
         <w:rPr>
           <w:rFonts w:hint="eastAsia"/>
@@ -12024,7 +12080,7 @@
       <w:pPr>
         <w:pStyle w:val="3"/>
       </w:pPr>
-      <w:bookmarkStart w:id="19" w:name="_Toc225771126"/>
+      <w:bookmarkStart w:id="19" w:name="_Toc226636056"/>
       <w:r>
         <w:rPr>
           <w:rFonts w:hint="eastAsia"/>
@@ -12192,7 +12248,7 @@
       <w:pPr>
         <w:pStyle w:val="2"/>
       </w:pPr>
-      <w:bookmarkStart w:id="20" w:name="_Toc225771127"/>
+      <w:bookmarkStart w:id="20" w:name="_Toc226636057"/>
       <w:r>
         <w:rPr>
           <w:rFonts w:hint="eastAsia"/>
@@ -12211,7 +12267,7 @@
       <w:pPr>
         <w:pStyle w:val="3"/>
       </w:pPr>
-      <w:bookmarkStart w:id="21" w:name="_Toc225771128"/>
+      <w:bookmarkStart w:id="21" w:name="_Toc226636058"/>
       <w:r>
         <w:rPr>
           <w:rFonts w:hint="eastAsia"/>
@@ -12351,7 +12407,7 @@
       <w:pPr>
         <w:pStyle w:val="3"/>
       </w:pPr>
-      <w:bookmarkStart w:id="22" w:name="_Toc225771129"/>
+      <w:bookmarkStart w:id="22" w:name="_Toc226636059"/>
       <w:r>
         <w:rPr>
           <w:rFonts w:hint="eastAsia"/>
@@ -12502,7 +12558,7 @@
       <w:pPr>
         <w:pStyle w:val="2"/>
       </w:pPr>
-      <w:bookmarkStart w:id="23" w:name="_Toc225771130"/>
+      <w:bookmarkStart w:id="23" w:name="_Toc226636060"/>
       <w:r>
         <w:rPr>
           <w:rFonts w:hint="eastAsia"/>
@@ -12521,7 +12577,7 @@
       <w:pPr>
         <w:pStyle w:val="3"/>
       </w:pPr>
-      <w:bookmarkStart w:id="24" w:name="_Toc225771131"/>
+      <w:bookmarkStart w:id="24" w:name="_Toc226636061"/>
       <w:r>
         <w:rPr>
           <w:rFonts w:hint="eastAsia"/>
@@ -14964,7 +15020,7 @@
       <w:pPr>
         <w:pStyle w:val="3"/>
       </w:pPr>
-      <w:bookmarkStart w:id="25" w:name="_Toc225771132"/>
+      <w:bookmarkStart w:id="25" w:name="_Toc226636062"/>
       <w:r>
         <w:rPr>
           <w:rFonts w:hint="eastAsia"/>
@@ -15021,7 +15077,7 @@
       <w:pPr>
         <w:pStyle w:val="2"/>
       </w:pPr>
-      <w:bookmarkStart w:id="26" w:name="_Toc225771133"/>
+      <w:bookmarkStart w:id="26" w:name="_Toc226636063"/>
       <w:r>
         <w:rPr>
           <w:rFonts w:hint="eastAsia"/>
@@ -15040,7 +15096,7 @@
       <w:pPr>
         <w:pStyle w:val="3"/>
       </w:pPr>
-      <w:bookmarkStart w:id="27" w:name="_Toc225771134"/>
+      <w:bookmarkStart w:id="27" w:name="_Toc226636064"/>
       <w:r>
         <w:rPr>
           <w:rFonts w:hint="eastAsia"/>
@@ -15205,7 +15261,7 @@
       <w:pPr>
         <w:pStyle w:val="3"/>
       </w:pPr>
-      <w:bookmarkStart w:id="28" w:name="_Toc225771135"/>
+      <w:bookmarkStart w:id="28" w:name="_Toc226636065"/>
       <w:r>
         <w:rPr>
           <w:rFonts w:hint="eastAsia"/>
@@ -15654,7 +15710,7 @@
       <w:pPr>
         <w:pStyle w:val="2"/>
       </w:pPr>
-      <w:bookmarkStart w:id="29" w:name="_Toc225771136"/>
+      <w:bookmarkStart w:id="29" w:name="_Toc226636066"/>
       <w:r>
         <w:rPr>
           <w:rFonts w:hint="eastAsia"/>
@@ -15826,7 +15882,7 @@
       <w:pPr>
         <w:pStyle w:val="3"/>
       </w:pPr>
-      <w:bookmarkStart w:id="30" w:name="_Toc225771137"/>
+      <w:bookmarkStart w:id="30" w:name="_Toc226636067"/>
       <w:r>
         <w:rPr>
           <w:rFonts w:hint="eastAsia"/>
@@ -16080,7 +16136,7 @@
       <w:pPr>
         <w:pStyle w:val="3"/>
       </w:pPr>
-      <w:bookmarkStart w:id="31" w:name="_Toc225771138"/>
+      <w:bookmarkStart w:id="31" w:name="_Toc226636068"/>
       <w:r>
         <w:rPr>
           <w:rFonts w:hint="eastAsia"/>
@@ -16341,7 +16397,7 @@
       <w:pPr>
         <w:pStyle w:val="3"/>
       </w:pPr>
-      <w:bookmarkStart w:id="32" w:name="_Toc225771139"/>
+      <w:bookmarkStart w:id="32" w:name="_Toc226636069"/>
       <w:r>
         <w:rPr>
           <w:rFonts w:hint="eastAsia"/>
@@ -17804,7 +17860,7 @@
       <w:pPr>
         <w:pStyle w:val="3"/>
       </w:pPr>
-      <w:bookmarkStart w:id="33" w:name="_Toc225771140"/>
+      <w:bookmarkStart w:id="33" w:name="_Toc226636070"/>
       <w:r>
         <w:rPr>
           <w:rFonts w:hint="eastAsia"/>
@@ -18085,7 +18141,7 @@
       <w:pPr>
         <w:pStyle w:val="3"/>
       </w:pPr>
-      <w:bookmarkStart w:id="34" w:name="_Toc225771141"/>
+      <w:bookmarkStart w:id="34" w:name="_Toc226636071"/>
       <w:r>
         <w:rPr>
           <w:rFonts w:hint="eastAsia"/>
@@ -18585,7 +18641,7 @@
       <w:pPr>
         <w:pStyle w:val="2"/>
       </w:pPr>
-      <w:bookmarkStart w:id="35" w:name="_Toc225771142"/>
+      <w:bookmarkStart w:id="35" w:name="_Toc226636072"/>
       <w:r>
         <w:rPr>
           <w:rFonts w:hint="eastAsia"/>
@@ -18604,7 +18660,7 @@
       <w:pPr>
         <w:pStyle w:val="3"/>
       </w:pPr>
-      <w:bookmarkStart w:id="36" w:name="_Toc225771143"/>
+      <w:bookmarkStart w:id="36" w:name="_Toc226636073"/>
       <w:r>
         <w:rPr>
           <w:rFonts w:hint="eastAsia"/>
@@ -18991,7 +19047,7 @@
       <w:pPr>
         <w:pStyle w:val="3"/>
       </w:pPr>
-      <w:bookmarkStart w:id="37" w:name="_Toc225771144"/>
+      <w:bookmarkStart w:id="37" w:name="_Toc226636074"/>
       <w:r>
         <w:rPr>
           <w:rFonts w:hint="eastAsia"/>
@@ -19694,7 +19750,7 @@
       <w:pPr>
         <w:pStyle w:val="2"/>
       </w:pPr>
-      <w:bookmarkStart w:id="38" w:name="_Toc225771145"/>
+      <w:bookmarkStart w:id="38" w:name="_Toc226636075"/>
       <w:r>
         <w:rPr>
           <w:rFonts w:hint="eastAsia"/>
@@ -19856,7 +19912,7 @@
       <w:pPr>
         <w:pStyle w:val="3"/>
       </w:pPr>
-      <w:bookmarkStart w:id="39" w:name="_Toc225771146"/>
+      <w:bookmarkStart w:id="39" w:name="_Toc226636076"/>
       <w:r>
         <w:rPr>
           <w:rFonts w:hint="eastAsia"/>
@@ -20224,7 +20280,7 @@
       <w:pPr>
         <w:pStyle w:val="3"/>
       </w:pPr>
-      <w:bookmarkStart w:id="40" w:name="_Toc225771147"/>
+      <w:bookmarkStart w:id="40" w:name="_Toc226636077"/>
       <w:r>
         <w:rPr>
           <w:rFonts w:hint="eastAsia"/>
@@ -20264,7 +20320,7 @@
       <w:pPr>
         <w:pStyle w:val="1"/>
       </w:pPr>
-      <w:bookmarkStart w:id="41" w:name="_Toc225771148"/>
+      <w:bookmarkStart w:id="41" w:name="_Toc226636078"/>
       <w:r>
         <w:rPr>
           <w:rFonts w:hint="eastAsia"/>
@@ -20349,7 +20405,7 @@
       <w:pPr>
         <w:pStyle w:val="2"/>
       </w:pPr>
-      <w:bookmarkStart w:id="42" w:name="_Toc225771149"/>
+      <w:bookmarkStart w:id="42" w:name="_Toc226636079"/>
       <w:r>
         <w:rPr>
           <w:rFonts w:hint="eastAsia"/>
@@ -20484,7 +20540,7 @@
       <w:pPr>
         <w:pStyle w:val="2"/>
       </w:pPr>
-      <w:bookmarkStart w:id="43" w:name="_Toc225771150"/>
+      <w:bookmarkStart w:id="43" w:name="_Toc226636080"/>
       <w:r>
         <w:rPr>
           <w:rFonts w:hint="eastAsia"/>
@@ -20784,7 +20840,7 @@
       <w:pPr>
         <w:pStyle w:val="1"/>
       </w:pPr>
-      <w:bookmarkStart w:id="44" w:name="_Toc225771151"/>
+      <w:bookmarkStart w:id="44" w:name="_Toc226636081"/>
       <w:r>
         <w:rPr>
           <w:rFonts w:hint="eastAsia"/>
@@ -20919,7 +20975,7 @@
       <w:pPr>
         <w:pStyle w:val="2"/>
       </w:pPr>
-      <w:bookmarkStart w:id="45" w:name="_Toc225771152"/>
+      <w:bookmarkStart w:id="45" w:name="_Toc226636082"/>
       <w:r>
         <w:rPr>
           <w:rFonts w:hint="eastAsia"/>
@@ -20960,7 +21016,7 @@
       <w:pPr>
         <w:pStyle w:val="2"/>
       </w:pPr>
-      <w:bookmarkStart w:id="46" w:name="_Toc225771153"/>
+      <w:bookmarkStart w:id="46" w:name="_Toc226636083"/>
       <w:r>
         <w:rPr>
           <w:rFonts w:hint="eastAsia"/>
@@ -20992,7 +21048,7 @@
       <w:pPr>
         <w:pStyle w:val="2"/>
       </w:pPr>
-      <w:bookmarkStart w:id="47" w:name="_Toc225771154"/>
+      <w:bookmarkStart w:id="47" w:name="_Toc226636084"/>
       <w:r>
         <w:rPr>
           <w:rFonts w:hint="eastAsia"/>
@@ -21025,7 +21081,7 @@
       <w:pPr>
         <w:pStyle w:val="2"/>
       </w:pPr>
-      <w:bookmarkStart w:id="48" w:name="_Toc225771155"/>
+      <w:bookmarkStart w:id="48" w:name="_Toc226636085"/>
       <w:r>
         <w:rPr>
           <w:rFonts w:hint="eastAsia"/>
@@ -21135,7 +21191,7 @@
       <w:pPr>
         <w:pStyle w:val="1"/>
       </w:pPr>
-      <w:bookmarkStart w:id="49" w:name="_Toc225771156"/>
+      <w:bookmarkStart w:id="49" w:name="_Toc226636086"/>
       <w:r>
         <w:rPr>
           <w:rFonts w:hint="eastAsia"/>
@@ -21321,7 +21377,7 @@
       <w:pPr>
         <w:pStyle w:val="1"/>
       </w:pPr>
-      <w:bookmarkStart w:id="50" w:name="_Toc225771157"/>
+      <w:bookmarkStart w:id="50" w:name="_Toc226636087"/>
       <w:r>
         <w:rPr>
           <w:rFonts w:hint="eastAsia"/>
@@ -21531,7 +21587,7 @@
       <w:pPr>
         <w:pStyle w:val="1"/>
       </w:pPr>
-      <w:bookmarkStart w:id="51" w:name="_Toc225771158"/>
+      <w:bookmarkStart w:id="51" w:name="_Toc226636088"/>
       <w:r>
         <w:rPr>
           <w:rFonts w:hint="eastAsia"/>
@@ -21544,7 +21600,7 @@
       <w:pPr>
         <w:pStyle w:val="2"/>
       </w:pPr>
-      <w:bookmarkStart w:id="52" w:name="_Toc225771159"/>
+      <w:bookmarkStart w:id="52" w:name="_Toc226636089"/>
       <w:r>
         <w:rPr>
           <w:rFonts w:hint="eastAsia"/>
@@ -24353,6 +24409,10 @@
 </file>
 
 <file path=customXml/item1.xml><?xml version="1.0" encoding="utf-8"?>
+<b:Sources xmlns:b="http://schemas.openxmlformats.org/officeDocument/2006/bibliography" xmlns="http://schemas.openxmlformats.org/officeDocument/2006/bibliography" SelectedStyle="\APASixthEditionOfficeOnline.xsl" StyleName="APA" Version="6"/>
+</file>
+
+<file path=customXml/item2.xml><?xml version="1.0" encoding="utf-8"?>
 <s:customData xmlns="http://www.wps.cn/officeDocument/2013/wpsCustomData" xmlns:s="http://www.wps.cn/officeDocument/2013/wpsCustomData">
   <customSectProps/>
   <customShpExts>
@@ -24361,22 +24421,18 @@
 </s:customData>
 </file>
 
-<file path=customXml/item2.xml><?xml version="1.0" encoding="utf-8"?>
-<b:Sources xmlns:b="http://schemas.openxmlformats.org/officeDocument/2006/bibliography" xmlns="http://schemas.openxmlformats.org/officeDocument/2006/bibliography" SelectedStyle="\APASixthEditionOfficeOnline.xsl" StyleName="APA" Version="6"/>
+<file path=customXml/itemProps1.xml><?xml version="1.0" encoding="utf-8"?>
+<ds:datastoreItem xmlns:ds="http://schemas.openxmlformats.org/officeDocument/2006/customXml" ds:itemID="{A3C42FEF-274B-4BDA-8559-31DB942021F2}">
+  <ds:schemaRefs>
+    <ds:schemaRef ds:uri="http://schemas.openxmlformats.org/officeDocument/2006/bibliography"/>
+  </ds:schemaRefs>
+</ds:datastoreItem>
 </file>
 
-<file path=customXml/itemProps1.xml><?xml version="1.0" encoding="utf-8"?>
+<file path=customXml/itemProps2.xml><?xml version="1.0" encoding="utf-8"?>
 <ds:datastoreItem xmlns:ds="http://schemas.openxmlformats.org/officeDocument/2006/customXml" ds:itemID="{B1977F7D-205B-4081-913C-38D41E755F92}">
   <ds:schemaRefs>
     <ds:schemaRef ds:uri="http://www.wps.cn/officeDocument/2013/wpsCustomData"/>
   </ds:schemaRefs>
 </ds:datastoreItem>
-</file>
-
-<file path=customXml/itemProps2.xml><?xml version="1.0" encoding="utf-8"?>
-<ds:datastoreItem xmlns:ds="http://schemas.openxmlformats.org/officeDocument/2006/customXml" ds:itemID="{A3C42FEF-274B-4BDA-8559-31DB942021F2}">
-  <ds:schemaRefs>
-    <ds:schemaRef ds:uri="http://schemas.openxmlformats.org/officeDocument/2006/bibliography"/>
-  </ds:schemaRefs>
-</ds:datastoreItem>
 </file>
</xml_diff>